<commit_message>
docs(tfm): rebuild limpio del PDF con el título actual (portada rancia con título anterior corregida)
</commit_message>
<xml_diff>
--- a/MEMORIA/tfm/Anexo I.docx
+++ b/MEMORIA/tfm/Anexo I.docx
@@ -47,17 +47,15 @@
         <w:rPr>
           <w:b/>
           <w:bCs/>
-          <w:color w:val="000000"/>
-          <w:lang w:val="es-ES"/>
-        </w:rPr>
-        <w:t xml:space="preserve">Parsimonia frente a </w:t>
+          <w:lang w:val="es-ES"/>
+        </w:rPr>
+        <w:t xml:space="preserve">Transferibilidad de </w:t>
       </w:r>
       <w:proofErr w:type="spellStart"/>
       <w:r>
         <w:rPr>
           <w:b/>
           <w:bCs/>
-          <w:color w:val="000000"/>
           <w:lang w:val="es-ES"/>
         </w:rPr>
         <w:t>Stockformer</w:t>
@@ -67,16 +65,21 @@
         <w:rPr>
           <w:b/>
           <w:bCs/>
-          <w:color w:val="000000"/>
-          <w:lang w:val="es-ES"/>
-        </w:rPr>
-        <w:t xml:space="preserve"> en el S&amp;P 500: transferencia fallida y dónde reside el retorno</w:t>
-      </w:r>
-      <w:r>
-        <w:rPr>
-          <w:lang w:val="es-ES"/>
-        </w:rPr>
-        <w:t xml:space="preserve"> la ETS de Ingeniería – ICAI de la Universidad Pontificia Comillas en el curso académico </w:t>
+          <w:lang w:val="es-ES"/>
+        </w:rPr>
+        <w:t xml:space="preserve"> al S&amp;P 500 y atribución del retorno neto</w:t>
+      </w:r>
+      <w:r>
+        <w:rPr>
+          <w:lang w:val="es-ES"/>
+        </w:rPr>
+        <w:t xml:space="preserve"> </w:t>
+      </w:r>
+      <w:r>
+        <w:rPr>
+          <w:lang w:val="es-ES"/>
+        </w:rPr>
+        <w:t xml:space="preserve">la ETS de Ingeniería – ICAI de la Universidad Pontificia Comillas en el curso académico </w:t>
       </w:r>
       <w:r>
         <w:rPr>

</xml_diff>